<commit_message>
Release Levitate build 23
</commit_message>
<xml_diff>
--- a/docs/paso_a_paso_envio_mails_apps_script.docx
+++ b/docs/paso_a_paso_envio_mails_apps_script.docx
@@ -113,7 +113,7 @@
           <w:b w:val="0"/>
           <w:color w:val="000000"/>
         </w:rPr>
-        <w:t>Tener a mano el script que les vamos a pasar.</w:t>
+        <w:t>Tener a mano el script completo que les vamos a pasar.</w:t>
       </w:r>
     </w:p>
     <w:p>
@@ -195,7 +195,67 @@
           <w:b w:val="0"/>
           <w:color w:val="000000"/>
         </w:rPr>
-        <w:t>Pegar el script en el archivo principal, normalmente llamado Code.gs.</w:t>
+        <w:t>Abrir Código.gs y pegar ahí el script completo de envío de mails.</w:t>
+      </w:r>
+    </w:p>
+    <w:p>
+      <w:pPr>
+        <w:pStyle w:val="ListNumber"/>
+        <w:spacing w:after="80" w:line="276" w:lineRule="auto"/>
+        <w:ind w:left="720" w:hanging="360"/>
+      </w:pPr>
+      <w:r>
+        <w:rPr>
+          <w:rFonts w:ascii="Arial" w:hAnsi="Arial" w:eastAsia="Arial"/>
+          <w:b w:val="0"/>
+          <w:color w:val="000000"/>
+        </w:rPr>
+        <w:t>Abrir Configuración del proyecto, en el engranaje de la izquierda.</w:t>
+      </w:r>
+    </w:p>
+    <w:p>
+      <w:pPr>
+        <w:pStyle w:val="ListNumber"/>
+        <w:spacing w:after="80" w:line="276" w:lineRule="auto"/>
+        <w:ind w:left="720" w:hanging="360"/>
+      </w:pPr>
+      <w:r>
+        <w:rPr>
+          <w:rFonts w:ascii="Arial" w:hAnsi="Arial" w:eastAsia="Arial"/>
+          <w:b w:val="0"/>
+          <w:color w:val="000000"/>
+        </w:rPr>
+        <w:t>Activar Mostrar el archivo de manifiesto appsscript.json en el editor, si no aparece todavía.</w:t>
+      </w:r>
+    </w:p>
+    <w:p>
+      <w:pPr>
+        <w:pStyle w:val="ListNumber"/>
+        <w:spacing w:after="80" w:line="276" w:lineRule="auto"/>
+        <w:ind w:left="720" w:hanging="360"/>
+      </w:pPr>
+      <w:r>
+        <w:rPr>
+          <w:rFonts w:ascii="Arial" w:hAnsi="Arial" w:eastAsia="Arial"/>
+          <w:b w:val="0"/>
+          <w:color w:val="000000"/>
+        </w:rPr>
+        <w:t>Volver al editor, abrir appsscript.json y reemplazar su contenido por el bloque de configuración de abajo.</w:t>
+      </w:r>
+    </w:p>
+    <w:p>
+      <w:pPr>
+        <w:pStyle w:val="ListNumber"/>
+        <w:spacing w:after="80" w:line="276" w:lineRule="auto"/>
+        <w:ind w:left="720" w:hanging="360"/>
+      </w:pPr>
+      <w:r>
+        <w:rPr>
+          <w:rFonts w:ascii="Arial" w:hAnsi="Arial" w:eastAsia="Arial"/>
+          <w:b w:val="0"/>
+          <w:color w:val="000000"/>
+        </w:rPr>
+        <w:t>Guardar todo.</w:t>
       </w:r>
     </w:p>
     <w:p>
@@ -285,7 +345,7 @@
           <w:b w:val="0"/>
           <w:color w:val="000000"/>
         </w:rPr>
-        <w:t>Configurar Execute as / Ejecutar como: Me / Yo.</w:t>
+        <w:t>Confirmar Execute as / Ejecutar como: Me / Yo.</w:t>
       </w:r>
     </w:p>
     <w:p>
@@ -300,7 +360,7 @@
           <w:b w:val="0"/>
           <w:color w:val="000000"/>
         </w:rPr>
-        <w:t>Configurar Who has access / Quién tiene acceso: Anyone with the link / Cualquiera con el vínculo.</w:t>
+        <w:t>Confirmar Who has access / Quién tiene acceso: Anyone with the link / Cualquiera con el vínculo.</w:t>
       </w:r>
     </w:p>
     <w:p>
@@ -347,6 +407,278 @@
         </w:rPr>
         <w:t>Enviar esa URL al equipo técnico.</w:t>
       </w:r>
+    </w:p>
+    <w:p>
+      <w:pPr>
+        <w:pStyle w:val="Heading1"/>
+      </w:pPr>
+      <w:r>
+        <w:rPr>
+          <w:rFonts w:ascii="Arial" w:hAnsi="Arial" w:eastAsia="Arial"/>
+          <w:b w:val="0"/>
+          <w:color w:val="000000"/>
+          <w:sz w:val="40"/>
+        </w:rPr>
+        <w:t>Configuración de appsscript.json</w:t>
+      </w:r>
+    </w:p>
+    <w:p>
+      <w:pPr>
+        <w:spacing w:before="0" w:after="160" w:line="276" w:lineRule="auto"/>
+      </w:pPr>
+      <w:r>
+        <w:rPr>
+          <w:rFonts w:ascii="Arial" w:hAnsi="Arial" w:eastAsia="Arial"/>
+          <w:b w:val="0"/>
+          <w:color w:val="000000"/>
+        </w:rPr>
+        <w:t>Para Ciudad de México, la zona horaria correcta es America/Mexico_City. Pegá este contenido completo en appsscript.json:</w:t>
+      </w:r>
+    </w:p>
+    <w:p>
+      <w:pPr>
+        <w:pStyle w:val="CodeLine"/>
+        <w:spacing w:after="0" w:line="240" w:lineRule="auto"/>
+        <w:ind w:left="504"/>
+      </w:pPr>
+      <w:r>
+        <w:rPr>
+          <w:rFonts w:ascii="Courier New" w:hAnsi="Courier New" w:eastAsia="Courier New"/>
+          <w:b w:val="0"/>
+          <w:color w:val="000000"/>
+          <w:sz w:val="17"/>
+        </w:rPr>
+        <w:t>{</w:t>
+      </w:r>
+    </w:p>
+    <w:p>
+      <w:pPr>
+        <w:pStyle w:val="CodeLine"/>
+        <w:spacing w:after="0" w:line="240" w:lineRule="auto"/>
+        <w:ind w:left="504"/>
+      </w:pPr>
+      <w:r>
+        <w:rPr>
+          <w:rFonts w:ascii="Courier New" w:hAnsi="Courier New" w:eastAsia="Courier New"/>
+          <w:b w:val="0"/>
+          <w:color w:val="000000"/>
+          <w:sz w:val="17"/>
+        </w:rPr>
+        <w:t xml:space="preserve">  "timeZone": "America/Mexico_City",</w:t>
+      </w:r>
+    </w:p>
+    <w:p>
+      <w:pPr>
+        <w:pStyle w:val="CodeLine"/>
+        <w:spacing w:after="0" w:line="240" w:lineRule="auto"/>
+        <w:ind w:left="504"/>
+      </w:pPr>
+      <w:r>
+        <w:rPr>
+          <w:rFonts w:ascii="Courier New" w:hAnsi="Courier New" w:eastAsia="Courier New"/>
+          <w:b w:val="0"/>
+          <w:color w:val="000000"/>
+          <w:sz w:val="17"/>
+        </w:rPr>
+        <w:t xml:space="preserve">  "exceptionLogging": "STACKDRIVER",</w:t>
+      </w:r>
+    </w:p>
+    <w:p>
+      <w:pPr>
+        <w:pStyle w:val="CodeLine"/>
+        <w:spacing w:after="0" w:line="240" w:lineRule="auto"/>
+        <w:ind w:left="504"/>
+      </w:pPr>
+      <w:r>
+        <w:rPr>
+          <w:rFonts w:ascii="Courier New" w:hAnsi="Courier New" w:eastAsia="Courier New"/>
+          <w:b w:val="0"/>
+          <w:color w:val="000000"/>
+          <w:sz w:val="17"/>
+        </w:rPr>
+        <w:t xml:space="preserve">  "runtimeVersion": "V8",</w:t>
+      </w:r>
+    </w:p>
+    <w:p>
+      <w:pPr>
+        <w:pStyle w:val="CodeLine"/>
+        <w:spacing w:after="0" w:line="240" w:lineRule="auto"/>
+        <w:ind w:left="504"/>
+      </w:pPr>
+      <w:r>
+        <w:rPr>
+          <w:rFonts w:ascii="Courier New" w:hAnsi="Courier New" w:eastAsia="Courier New"/>
+          <w:b w:val="0"/>
+          <w:color w:val="000000"/>
+          <w:sz w:val="17"/>
+        </w:rPr>
+        <w:t xml:space="preserve">  "oauthScopes": [</w:t>
+      </w:r>
+    </w:p>
+    <w:p>
+      <w:pPr>
+        <w:pStyle w:val="CodeLine"/>
+        <w:spacing w:after="0" w:line="240" w:lineRule="auto"/>
+        <w:ind w:left="504"/>
+      </w:pPr>
+      <w:r>
+        <w:rPr>
+          <w:rFonts w:ascii="Courier New" w:hAnsi="Courier New" w:eastAsia="Courier New"/>
+          <w:b w:val="0"/>
+          <w:color w:val="000000"/>
+          <w:sz w:val="17"/>
+        </w:rPr>
+        <w:t xml:space="preserve">    "https://www.googleapis.com/auth/script.external_request",</w:t>
+      </w:r>
+    </w:p>
+    <w:p>
+      <w:pPr>
+        <w:pStyle w:val="CodeLine"/>
+        <w:spacing w:after="0" w:line="240" w:lineRule="auto"/>
+        <w:ind w:left="504"/>
+      </w:pPr>
+      <w:r>
+        <w:rPr>
+          <w:rFonts w:ascii="Courier New" w:hAnsi="Courier New" w:eastAsia="Courier New"/>
+          <w:b w:val="0"/>
+          <w:color w:val="000000"/>
+          <w:sz w:val="17"/>
+        </w:rPr>
+        <w:t xml:space="preserve">    "https://www.googleapis.com/auth/drive",</w:t>
+      </w:r>
+    </w:p>
+    <w:p>
+      <w:pPr>
+        <w:pStyle w:val="CodeLine"/>
+        <w:spacing w:after="0" w:line="240" w:lineRule="auto"/>
+        <w:ind w:left="504"/>
+      </w:pPr>
+      <w:r>
+        <w:rPr>
+          <w:rFonts w:ascii="Courier New" w:hAnsi="Courier New" w:eastAsia="Courier New"/>
+          <w:b w:val="0"/>
+          <w:color w:val="000000"/>
+          <w:sz w:val="17"/>
+        </w:rPr>
+        <w:t xml:space="preserve">    "https://www.googleapis.com/auth/script.send_mail",</w:t>
+      </w:r>
+    </w:p>
+    <w:p>
+      <w:pPr>
+        <w:pStyle w:val="CodeLine"/>
+        <w:spacing w:after="0" w:line="240" w:lineRule="auto"/>
+        <w:ind w:left="504"/>
+      </w:pPr>
+      <w:r>
+        <w:rPr>
+          <w:rFonts w:ascii="Courier New" w:hAnsi="Courier New" w:eastAsia="Courier New"/>
+          <w:b w:val="0"/>
+          <w:color w:val="000000"/>
+          <w:sz w:val="17"/>
+        </w:rPr>
+        <w:t xml:space="preserve">    "https://www.googleapis.com/auth/script.storage"</w:t>
+      </w:r>
+    </w:p>
+    <w:p>
+      <w:pPr>
+        <w:pStyle w:val="CodeLine"/>
+        <w:spacing w:after="0" w:line="240" w:lineRule="auto"/>
+        <w:ind w:left="504"/>
+      </w:pPr>
+      <w:r>
+        <w:rPr>
+          <w:rFonts w:ascii="Courier New" w:hAnsi="Courier New" w:eastAsia="Courier New"/>
+          <w:b w:val="0"/>
+          <w:color w:val="000000"/>
+          <w:sz w:val="17"/>
+        </w:rPr>
+        <w:t xml:space="preserve">  ],</w:t>
+      </w:r>
+    </w:p>
+    <w:p>
+      <w:pPr>
+        <w:pStyle w:val="CodeLine"/>
+        <w:spacing w:after="0" w:line="240" w:lineRule="auto"/>
+        <w:ind w:left="504"/>
+      </w:pPr>
+      <w:r>
+        <w:rPr>
+          <w:rFonts w:ascii="Courier New" w:hAnsi="Courier New" w:eastAsia="Courier New"/>
+          <w:b w:val="0"/>
+          <w:color w:val="000000"/>
+          <w:sz w:val="17"/>
+        </w:rPr>
+        <w:t xml:space="preserve">  "webapp": {</w:t>
+      </w:r>
+    </w:p>
+    <w:p>
+      <w:pPr>
+        <w:pStyle w:val="CodeLine"/>
+        <w:spacing w:after="0" w:line="240" w:lineRule="auto"/>
+        <w:ind w:left="504"/>
+      </w:pPr>
+      <w:r>
+        <w:rPr>
+          <w:rFonts w:ascii="Courier New" w:hAnsi="Courier New" w:eastAsia="Courier New"/>
+          <w:b w:val="0"/>
+          <w:color w:val="000000"/>
+          <w:sz w:val="17"/>
+        </w:rPr>
+        <w:t xml:space="preserve">    "executeAs": "USER_DEPLOYING",</w:t>
+      </w:r>
+    </w:p>
+    <w:p>
+      <w:pPr>
+        <w:pStyle w:val="CodeLine"/>
+        <w:spacing w:after="0" w:line="240" w:lineRule="auto"/>
+        <w:ind w:left="504"/>
+      </w:pPr>
+      <w:r>
+        <w:rPr>
+          <w:rFonts w:ascii="Courier New" w:hAnsi="Courier New" w:eastAsia="Courier New"/>
+          <w:b w:val="0"/>
+          <w:color w:val="000000"/>
+          <w:sz w:val="17"/>
+        </w:rPr>
+        <w:t xml:space="preserve">    "access": "ANYONE_ANONYMOUS"</w:t>
+      </w:r>
+    </w:p>
+    <w:p>
+      <w:pPr>
+        <w:pStyle w:val="CodeLine"/>
+        <w:spacing w:after="0" w:line="240" w:lineRule="auto"/>
+        <w:ind w:left="504"/>
+      </w:pPr>
+      <w:r>
+        <w:rPr>
+          <w:rFonts w:ascii="Courier New" w:hAnsi="Courier New" w:eastAsia="Courier New"/>
+          <w:b w:val="0"/>
+          <w:color w:val="000000"/>
+          <w:sz w:val="17"/>
+        </w:rPr>
+        <w:t xml:space="preserve">  }</w:t>
+      </w:r>
+    </w:p>
+    <w:p>
+      <w:pPr>
+        <w:pStyle w:val="CodeLine"/>
+        <w:spacing w:after="0" w:line="240" w:lineRule="auto"/>
+        <w:ind w:left="504"/>
+      </w:pPr>
+      <w:r>
+        <w:rPr>
+          <w:rFonts w:ascii="Courier New" w:hAnsi="Courier New" w:eastAsia="Courier New"/>
+          <w:b w:val="0"/>
+          <w:color w:val="000000"/>
+          <w:sz w:val="17"/>
+        </w:rPr>
+        <w:t>}</w:t>
+      </w:r>
+    </w:p>
+    <w:p>
+      <w:pPr>
+        <w:spacing w:after="120"/>
+      </w:pPr>
     </w:p>
     <w:p>
       <w:pPr>
@@ -12895,6 +13227,17 @@
       </w:tcPr>
     </w:tblStylePr>
   </w:style>
+  <w:style w:type="paragraph" w:customStyle="1" w:styleId="CodeLine">
+    <w:name w:val="Code Line"/>
+    <w:pPr>
+      <w:spacing w:before="0" w:after="0" w:line="240" w:lineRule="auto"/>
+    </w:pPr>
+    <w:rPr>
+      <w:rFonts w:ascii="Courier New" w:hAnsi="Courier New" w:eastAsia="Courier New"/>
+      <w:color w:val="000000"/>
+      <w:sz w:val="17"/>
+    </w:rPr>
+  </w:style>
 </w:styles>
 </file>
 

</xml_diff>